<commit_message>
Nearing completion of revision. Deleted models having body size covariates because size does not correlate with fecundity.
</commit_message>
<xml_diff>
--- a/submission/current zoology/2025_earwig_fecundity_edited/Backup of 2025_earwig_fecundity_edited.docx
+++ b/submission/current zoology/2025_earwig_fecundity_edited/Backup of 2025_earwig_fecundity_edited.docx
@@ -438,33 +438,27 @@
       </w:ins>
       <w:ins w:id="29" w:author="Kelly, Clint Dale" w:date="2026-02-13T08:17:00Z" w16du:dateUtc="2026-02-13T13:17:00Z">
         <w:r>
-          <w:t xml:space="preserve">, in addition to </w:t>
-        </w:r>
-        <w:r>
-          <w:t>the mean egg perimeter for each egg</w:t>
-        </w:r>
+          <w:t>, in addition to the mean egg perimeter for each egg,</w:t>
+        </w:r>
+      </w:ins>
+      <w:r>
+        <w:t xml:space="preserve"> in all subsequent analyses.</w:t>
+      </w:r>
+      <w:ins w:id="30" w:author="Kelly, Clint Dale" w:date="2026-02-13T08:15:00Z" w16du:dateUtc="2026-02-13T13:15:00Z">
+        <w:r>
+          <w:t xml:space="preserve"> </w:t>
+        </w:r>
+      </w:ins>
+      <w:ins w:id="31" w:author="Kelly, Clint Dale" w:date="2026-02-13T08:30:00Z" w16du:dateUtc="2026-02-13T13:30:00Z">
+        <w:r>
+          <w:t>The final data set comprised 42 females</w:t>
+        </w:r>
+      </w:ins>
+      <w:ins w:id="32" w:author="Kelly, Clint Dale" w:date="2026-02-13T08:34:00Z" w16du:dateUtc="2026-02-13T13:34:00Z">
         <w:r>
           <w:t>,</w:t>
         </w:r>
       </w:ins>
-      <w:r>
-        <w:t xml:space="preserve"> in all subsequent analyses.</w:t>
-      </w:r>
-      <w:ins w:id="30" w:author="Kelly, Clint Dale" w:date="2026-02-13T08:15:00Z" w16du:dateUtc="2026-02-13T13:15:00Z">
-        <w:r>
-          <w:t xml:space="preserve"> </w:t>
-        </w:r>
-      </w:ins>
-      <w:ins w:id="31" w:author="Kelly, Clint Dale" w:date="2026-02-13T08:30:00Z" w16du:dateUtc="2026-02-13T13:30:00Z">
-        <w:r>
-          <w:t>The final data set comprised 42 females</w:t>
-        </w:r>
-      </w:ins>
-      <w:ins w:id="32" w:author="Kelly, Clint Dale" w:date="2026-02-13T08:34:00Z" w16du:dateUtc="2026-02-13T13:34:00Z">
-        <w:r>
-          <w:t>,</w:t>
-        </w:r>
-      </w:ins>
       <w:ins w:id="33" w:author="Kelly, Clint Dale" w:date="2026-02-13T08:30:00Z" w16du:dateUtc="2026-02-13T13:30:00Z">
         <w:r>
           <w:t xml:space="preserve"> each </w:t>
@@ -472,13 +466,7 @@
       </w:ins>
       <w:ins w:id="34" w:author="Kelly, Clint Dale" w:date="2026-02-13T08:35:00Z" w16du:dateUtc="2026-02-13T13:35:00Z">
         <w:r>
-          <w:t xml:space="preserve">with two clutches: on average, </w:t>
-        </w:r>
-        <w:r>
-          <w:t>xx</w:t>
-        </w:r>
-        <w:r>
-          <w:t xml:space="preserve"> eggs in the first clutch and xxx eggs in the second; the total number of egg-size</w:t>
+          <w:t>with two clutches: on average, xx eggs in the first clutch and xxx eggs in the second; the total number of egg-size</w:t>
         </w:r>
       </w:ins>
       <w:ins w:id="35" w:author="Kelly, Clint Dale" w:date="2026-02-13T08:34:00Z" w16du:dateUtc="2026-02-13T13:34:00Z">
@@ -1625,13 +1613,7 @@
       </w:r>
       <w:ins w:id="131" w:author="Kelly, Clint Dale" w:date="2026-02-12T16:37:00Z" w16du:dateUtc="2026-02-12T21:37:00Z">
         <w:r>
-          <w:t xml:space="preserve">. </w:t>
-        </w:r>
-        <w:r>
-          <w:t>This finding refutes the terminal investment hypothesis, as female second clutches were neither, on average, larger nor comprised larger eggs.</w:t>
-        </w:r>
-        <w:r>
-          <w:t xml:space="preserve"> </w:t>
+          <w:t xml:space="preserve">. This finding refutes the terminal investment hypothesis, as female second clutches were neither, on average, larger nor comprised larger eggs. </w:t>
         </w:r>
       </w:ins>
       <w:del w:id="132" w:author="Kelly, Clint Dale" w:date="2026-02-12T17:05:00Z" w16du:dateUtc="2026-02-12T22:05:00Z">
@@ -1980,10 +1962,7 @@
       </w:del>
       <w:ins w:id="179" w:author="Kelly, Clint Dale" w:date="2026-02-12T16:16:00Z" w16du:dateUtc="2026-02-12T21:16:00Z">
         <w:r>
-          <w:t>and</w:t>
-        </w:r>
-        <w:r>
-          <w:t xml:space="preserve"> </w:t>
+          <w:t xml:space="preserve">and </w:t>
         </w:r>
       </w:ins>
       <w:r>
@@ -2080,7 +2059,11 @@
         <w:pStyle w:val="BodyText"/>
       </w:pPr>
       <w:r>
-        <w:t xml:space="preserve">Among-female variation in average egg size was similar in both clutches, meaning that females exhibited similar levels of individuality in average egg size in both clutches. The repeatability of average egg size between clutches could indicate that egg size is a significantly heritable trait (e.g. Falconer and MacKay 1996). This would not be surprising as egg size has been demonstrated to be significantly heritable in a variety of insect species, including </w:t>
+        <w:t xml:space="preserve">Among-female variation in average egg size was similar in both clutches, meaning that females exhibited similar levels of individuality in average egg size in both clutches. The repeatability of average egg size between clutches could indicate that egg size is a significantly heritable trait (e.g. Falconer and MacKay 1996). </w:t>
+      </w:r>
+      <w:bookmarkStart w:id="192" w:name="_Hlk222399492"/>
+      <w:r>
+        <w:t xml:space="preserve">This would not be surprising as egg size has been demonstrated to be significantly heritable in a variety of insect species, including </w:t>
       </w:r>
       <w:r>
         <w:rPr>
@@ -2122,24 +2105,26 @@
       <w:r>
         <w:t xml:space="preserve">) (Harvey 1983). </w:t>
       </w:r>
-      <w:bookmarkStart w:id="192" w:name="_Hlk221800841"/>
-      <w:del w:id="193" w:author="Kelly, Clint Dale" w:date="2026-02-12T17:06:00Z" w16du:dateUtc="2026-02-12T22:06:00Z">
+      <w:bookmarkStart w:id="193" w:name="_Hlk221800841"/>
+      <w:bookmarkEnd w:id="192"/>
+      <w:del w:id="194" w:author="Kelly, Clint Dale" w:date="2026-02-12T17:06:00Z" w16du:dateUtc="2026-02-12T22:06:00Z">
         <w:r>
           <w:rPr>
             <w:highlight w:val="yellow"/>
-            <w:rPrChange w:id="194" w:author="Kelly, Clint Dale" w:date="2026-02-12T14:59:00Z" w16du:dateUtc="2026-02-12T19:59:00Z">
+            <w:rPrChange w:id="195" w:author="Kelly, Clint Dale" w:date="2026-02-12T14:59:00Z" w16du:dateUtc="2026-02-12T19:59:00Z">
               <w:rPr/>
             </w:rPrChange>
           </w:rPr>
           <w:delText>Moreover, the lack of between-female variation in average egg size between first and second clutches suggests that the food-acquisition environment (i.e. wild vs. lab) had little effect on average egg size.</w:delText>
         </w:r>
       </w:del>
-      <w:bookmarkEnd w:id="192"/>
+      <w:bookmarkEnd w:id="193"/>
     </w:p>
     <w:p>
       <w:pPr>
         <w:pStyle w:val="BodyText"/>
       </w:pPr>
+      <w:bookmarkStart w:id="196" w:name="OLE_LINK15"/>
       <w:r>
         <w:t>In contrast, I found evidence that variation in egg size within a clutch was greater in second clutches than in first clutches, the opposite of the pattern observed in birds. (e.g., Yosef and Zduniak 2008). Empiricists have argued that lower variation in egg size within a clutch is probably linked to environmental factors and food availability. For example, desert finches (</w:t>
       </w:r>
@@ -2163,7 +2148,7 @@
       <w:r>
         <w:t>) produced larger eggs with the laying sequence in favourable conditions (Hargitai et al. 2005), and blue tits (</w:t>
       </w:r>
-      <w:del w:id="195" w:author="Kelly, Clint Dale" w:date="2026-02-12T17:15:00Z" w16du:dateUtc="2026-02-12T22:15:00Z">
+      <w:del w:id="197" w:author="Kelly, Clint Dale" w:date="2026-02-12T17:15:00Z" w16du:dateUtc="2026-02-12T22:15:00Z">
         <w:r>
           <w:rPr>
             <w:i/>
@@ -2172,27 +2157,13 @@
           <w:delText xml:space="preserve">Paris </w:delText>
         </w:r>
       </w:del>
-      <w:ins w:id="196" w:author="Kelly, Clint Dale" w:date="2026-02-12T17:15:00Z" w16du:dateUtc="2026-02-12T22:15:00Z">
+      <w:ins w:id="198" w:author="Kelly, Clint Dale" w:date="2026-02-12T17:15:00Z" w16du:dateUtc="2026-02-12T22:15:00Z">
         <w:r>
           <w:rPr>
             <w:i/>
             <w:iCs/>
           </w:rPr>
-          <w:t>Par</w:t>
-        </w:r>
-        <w:r>
-          <w:rPr>
-            <w:i/>
-            <w:iCs/>
-          </w:rPr>
-          <w:t>u</w:t>
-        </w:r>
-        <w:r>
-          <w:rPr>
-            <w:i/>
-            <w:iCs/>
-          </w:rPr>
-          <w:t xml:space="preserve">s </w:t>
+          <w:t xml:space="preserve">Parus </w:t>
         </w:r>
       </w:ins>
       <w:r>
@@ -2209,26 +2180,26 @@
         <w:lastRenderedPageBreak/>
         <w:t xml:space="preserve">before producing their second clutch. If true, then females might have allocated resources maximally to the eggs in their first clutch, following an individual allocation strategy based on intrinsic factors such as body condition. This strategy would produce individual-specific egg sizes that are consistent across eggs within a clutch. In second clutches, by contrast, females might have allocated an optimal (but smaller) amount of resources to each oocyte until the last few oocytes, when they had fewer resources remaining and thus produced a few significantly smaller eggs. I did not record laying order in this study and therefore cannot assess whether larger eggs were laid first or last. Within-clutch variation in egg size is adaptive in birds. For example, larger eggs later in the egg-laying sequence may be a brood-survival strategy that counteracts the effects of hatching asynchrony, whereas smaller eggs later in the laying sequence may be a brood-reduction strategy (Slagsvold et al. 1984). However, it is unknown whether variation in egg size </w:t>
       </w:r>
-      <w:del w:id="197" w:author="Kelly, Clint Dale" w:date="2026-02-12T17:16:00Z" w16du:dateUtc="2026-02-12T22:16:00Z">
+      <w:del w:id="199" w:author="Kelly, Clint Dale" w:date="2026-02-12T17:16:00Z" w16du:dateUtc="2026-02-12T22:16:00Z">
         <w:r>
           <w:delText>ha</w:delText>
-        </w:r>
-      </w:del>
-      <w:ins w:id="198" w:author="Kelly, Clint Dale" w:date="2026-02-12T17:16:00Z" w16du:dateUtc="2026-02-12T22:16:00Z">
-        <w:r>
-          <w:t>serve</w:t>
-        </w:r>
-      </w:ins>
-      <w:r>
-        <w:t xml:space="preserve">s an equivalent adaptive function in insects </w:t>
-      </w:r>
-      <w:del w:id="199" w:author="Kelly, Clint Dale" w:date="2026-02-12T17:16:00Z" w16du:dateUtc="2026-02-12T22:16:00Z">
-        <w:r>
-          <w:delText>expressing</w:delText>
         </w:r>
       </w:del>
       <w:ins w:id="200" w:author="Kelly, Clint Dale" w:date="2026-02-12T17:16:00Z" w16du:dateUtc="2026-02-12T22:16:00Z">
         <w:r>
+          <w:t>serve</w:t>
+        </w:r>
+      </w:ins>
+      <w:r>
+        <w:t xml:space="preserve">s an equivalent adaptive function in insects </w:t>
+      </w:r>
+      <w:del w:id="201" w:author="Kelly, Clint Dale" w:date="2026-02-12T17:16:00Z" w16du:dateUtc="2026-02-12T22:16:00Z">
+        <w:r>
+          <w:delText>expressing</w:delText>
+        </w:r>
+      </w:del>
+      <w:ins w:id="202" w:author="Kelly, Clint Dale" w:date="2026-02-12T17:16:00Z" w16du:dateUtc="2026-02-12T22:16:00Z">
+        <w:r>
           <w:t>that express</w:t>
         </w:r>
       </w:ins>
@@ -2236,6 +2207,7 @@
         <w:t xml:space="preserve"> maternal care.</w:t>
       </w:r>
     </w:p>
+    <w:bookmarkEnd w:id="196"/>
     <w:p>
       <w:pPr>
         <w:pStyle w:val="BodyText"/>
@@ -2243,12 +2215,12 @@
       <w:r>
         <w:t xml:space="preserve">In conclusion, by partitioning variance into its among- and within-individual components, I found that female European earwigs do not trade off clutch and egg size. Instead, I found a positive correlation between egg number and size </w:t>
       </w:r>
-      <w:del w:id="201" w:author="Kelly, Clint Dale" w:date="2026-02-13T14:58:00Z" w16du:dateUtc="2026-02-13T19:58:00Z">
+      <w:del w:id="203" w:author="Kelly, Clint Dale" w:date="2026-02-13T14:58:00Z" w16du:dateUtc="2026-02-13T19:58:00Z">
         <w:r>
           <w:delText>and some evidence for an among-female trade-off</w:delText>
         </w:r>
       </w:del>
-      <w:ins w:id="202" w:author="Kelly, Clint Dale" w:date="2026-02-13T14:58:00Z" w16du:dateUtc="2026-02-13T19:58:00Z">
+      <w:ins w:id="204" w:author="Kelly, Clint Dale" w:date="2026-02-13T14:58:00Z" w16du:dateUtc="2026-02-13T19:58:00Z">
         <w:r>
           <w:t>within females</w:t>
         </w:r>
@@ -2256,23 +2228,23 @@
       <w:r>
         <w:t>.</w:t>
       </w:r>
-      <w:ins w:id="203" w:author="Kelly, Clint Dale" w:date="2026-02-13T14:58:00Z" w16du:dateUtc="2026-02-13T19:58:00Z">
+      <w:ins w:id="205" w:author="Kelly, Clint Dale" w:date="2026-02-13T14:58:00Z" w16du:dateUtc="2026-02-13T19:58:00Z">
         <w:r>
           <w:t xml:space="preserve"> </w:t>
         </w:r>
       </w:ins>
-      <w:bookmarkStart w:id="204" w:name="_Hlk221887479"/>
-      <w:ins w:id="205" w:author="Kelly, Clint Dale" w:date="2026-02-13T15:05:00Z">
+      <w:bookmarkStart w:id="206" w:name="_Hlk221887479"/>
+      <w:ins w:id="207" w:author="Kelly, Clint Dale" w:date="2026-02-13T15:05:00Z">
         <w:r>
           <w:t xml:space="preserve">My results suggest that proximate mechanisms may </w:t>
         </w:r>
       </w:ins>
-      <w:ins w:id="206" w:author="Kelly, Clint Dale" w:date="2026-02-13T15:05:00Z" w16du:dateUtc="2026-02-13T20:05:00Z">
+      <w:ins w:id="208" w:author="Kelly, Clint Dale" w:date="2026-02-13T15:05:00Z" w16du:dateUtc="2026-02-13T20:05:00Z">
         <w:r>
           <w:t>constrain</w:t>
         </w:r>
       </w:ins>
-      <w:ins w:id="207" w:author="Kelly, Clint Dale" w:date="2026-02-13T15:05:00Z">
+      <w:ins w:id="209" w:author="Kelly, Clint Dale" w:date="2026-02-13T15:05:00Z">
         <w:r>
           <w:t xml:space="preserve"> individuals’ ability to make trade-offs, such as when resources are equally allocated among eggs even though females possess limited resource </w:t>
         </w:r>
@@ -2281,12 +2253,12 @@
           <w:t>reserves.</w:t>
         </w:r>
       </w:ins>
-      <w:del w:id="208" w:author="Kelly, Clint Dale" w:date="2026-02-13T15:01:00Z" w16du:dateUtc="2026-02-13T20:01:00Z">
+      <w:del w:id="210" w:author="Kelly, Clint Dale" w:date="2026-02-13T15:01:00Z" w16du:dateUtc="2026-02-13T20:01:00Z">
         <w:r>
           <w:delText xml:space="preserve"> </w:delText>
         </w:r>
       </w:del>
-      <w:bookmarkEnd w:id="204"/>
+      <w:bookmarkEnd w:id="206"/>
       <w:r>
         <w:t>I</w:t>
       </w:r>
@@ -2299,7 +2271,7 @@
       <w:pPr>
         <w:pStyle w:val="Heading1"/>
       </w:pPr>
-      <w:bookmarkStart w:id="209" w:name="data-availability"/>
+      <w:bookmarkStart w:id="211" w:name="data-availability"/>
       <w:bookmarkEnd w:id="123"/>
       <w:r>
         <w:t>Data availability</w:t>
@@ -2317,8 +2289,8 @@
       <w:pPr>
         <w:pStyle w:val="Heading1"/>
       </w:pPr>
-      <w:bookmarkStart w:id="210" w:name="author-contributions"/>
-      <w:bookmarkEnd w:id="209"/>
+      <w:bookmarkStart w:id="212" w:name="author-contributions"/>
+      <w:bookmarkEnd w:id="211"/>
       <w:r>
         <w:lastRenderedPageBreak/>
         <w:t>Author contributions</w:t>
@@ -2336,8 +2308,8 @@
       <w:pPr>
         <w:pStyle w:val="Heading1"/>
       </w:pPr>
-      <w:bookmarkStart w:id="211" w:name="funding"/>
-      <w:bookmarkEnd w:id="210"/>
+      <w:bookmarkStart w:id="213" w:name="funding"/>
+      <w:bookmarkEnd w:id="212"/>
       <w:r>
         <w:t>Funding</w:t>
       </w:r>
@@ -2354,8 +2326,8 @@
       <w:pPr>
         <w:pStyle w:val="Heading1"/>
       </w:pPr>
-      <w:bookmarkStart w:id="212" w:name="conflict-of-interest"/>
-      <w:bookmarkEnd w:id="211"/>
+      <w:bookmarkStart w:id="214" w:name="conflict-of-interest"/>
+      <w:bookmarkEnd w:id="213"/>
       <w:r>
         <w:t>Conflict of Interest</w:t>
       </w:r>
@@ -2372,8 +2344,8 @@
       <w:pPr>
         <w:pStyle w:val="Heading1"/>
       </w:pPr>
-      <w:bookmarkStart w:id="213" w:name="acknowledgements"/>
-      <w:bookmarkEnd w:id="212"/>
+      <w:bookmarkStart w:id="215" w:name="acknowledgements"/>
+      <w:bookmarkEnd w:id="214"/>
       <w:r>
         <w:t>Acknowledgements</w:t>
       </w:r>
@@ -2395,8 +2367,8 @@
       <w:pPr>
         <w:pStyle w:val="Heading1"/>
       </w:pPr>
-      <w:bookmarkStart w:id="214" w:name="references"/>
-      <w:bookmarkEnd w:id="213"/>
+      <w:bookmarkStart w:id="216" w:name="references"/>
+      <w:bookmarkEnd w:id="215"/>
       <w:r>
         <w:lastRenderedPageBreak/>
         <w:t>References</w:t>
@@ -2406,8 +2378,8 @@
       <w:pPr>
         <w:pStyle w:val="Bibliography"/>
       </w:pPr>
-      <w:bookmarkStart w:id="215" w:name="ref-bernardo1996"/>
-      <w:bookmarkStart w:id="216" w:name="refs"/>
+      <w:bookmarkStart w:id="217" w:name="ref-bernardo1996"/>
+      <w:bookmarkStart w:id="218" w:name="refs"/>
       <w:r>
         <w:t>Bernardo, J. 1996. The particular maternal effect of propagule size, especially egg size: Patterns, models, quality of evidence and interpretations. Am Zool 36:216–236.</w:t>
       </w:r>
@@ -2416,8 +2388,8 @@
       <w:pPr>
         <w:pStyle w:val="Bibliography"/>
       </w:pPr>
-      <w:bookmarkStart w:id="217" w:name="ref-boos2014"/>
-      <w:bookmarkEnd w:id="215"/>
+      <w:bookmarkStart w:id="219" w:name="ref-boos2014"/>
+      <w:bookmarkEnd w:id="217"/>
       <w:r>
         <w:t>Boos, S., J. Meunier, S. Pichon, and M. Kölliker. 2014. Maternal care provides antifungal protection to eggs in the european earwig. Behav Ecol 25:754–761.</w:t>
       </w:r>
@@ -2426,8 +2398,8 @@
       <w:pPr>
         <w:pStyle w:val="Bibliography"/>
       </w:pPr>
-      <w:bookmarkStart w:id="218" w:name="ref-burkner2017"/>
-      <w:bookmarkEnd w:id="217"/>
+      <w:bookmarkStart w:id="220" w:name="ref-burkner2017"/>
+      <w:bookmarkEnd w:id="219"/>
       <w:r>
         <w:t>Bürkner, P.-C. 2017. brms: An R package for Bayesian multilevel models using Stan. Journal of Statistical Software 80:4308.</w:t>
       </w:r>
@@ -2436,8 +2408,8 @@
       <w:pPr>
         <w:pStyle w:val="Bibliography"/>
       </w:pPr>
-      <w:bookmarkStart w:id="219" w:name="ref-careau2017"/>
-      <w:bookmarkEnd w:id="218"/>
+      <w:bookmarkStart w:id="221" w:name="ref-careau2017"/>
+      <w:bookmarkEnd w:id="220"/>
       <w:r>
         <w:t>Careau, V., and R. Wilson. 2017. Of uberfleas and krakens: Detecting trade-offs using mixed models. Integr Comp Biol 57:362–371.</w:t>
       </w:r>
@@ -2446,8 +2418,8 @@
       <w:pPr>
         <w:pStyle w:val="Bibliography"/>
       </w:pPr>
-      <w:bookmarkStart w:id="220" w:name="ref-cavaleiro2014"/>
-      <w:bookmarkEnd w:id="219"/>
+      <w:bookmarkStart w:id="222" w:name="ref-cavaleiro2014"/>
+      <w:bookmarkEnd w:id="221"/>
       <w:r>
         <w:t>Cavaleiro, F. I., and M. J. Santos. 2014. Egg number-egg size: An important trade-off in parasite life history strategies. Int J Parasitol 44:173–182.</w:t>
       </w:r>
@@ -2456,8 +2428,8 @@
       <w:pPr>
         <w:pStyle w:val="Bibliography"/>
       </w:pPr>
-      <w:bookmarkStart w:id="221" w:name="ref-church2019"/>
-      <w:bookmarkEnd w:id="220"/>
+      <w:bookmarkStart w:id="223" w:name="ref-church2019"/>
+      <w:bookmarkEnd w:id="222"/>
       <w:r>
         <w:t>Church, S. H., S. Donoughe, B. A. S. de Medeiros, and C. G. Extavour. 2019. Insect egg size and shape evolve with ecology but not developmental rate. Nature 571:58–62.</w:t>
       </w:r>
@@ -2466,8 +2438,8 @@
       <w:pPr>
         <w:pStyle w:val="Bibliography"/>
       </w:pPr>
-      <w:bookmarkStart w:id="222" w:name="ref-clutton-brock1984"/>
-      <w:bookmarkEnd w:id="221"/>
+      <w:bookmarkStart w:id="224" w:name="ref-clutton-brock1984"/>
+      <w:bookmarkEnd w:id="223"/>
       <w:r>
         <w:t>Clutton-Brock, T. H. 1984. Reproductive effort and terminal investment in iteroparous animals. Am Nat 123:212–229.</w:t>
       </w:r>
@@ -2476,8 +2448,8 @@
       <w:pPr>
         <w:pStyle w:val="Bibliography"/>
       </w:pPr>
-      <w:bookmarkStart w:id="223" w:name="ref-clutton-brock1991"/>
-      <w:bookmarkEnd w:id="222"/>
+      <w:bookmarkStart w:id="225" w:name="ref-clutton-brock1991"/>
+      <w:bookmarkEnd w:id="224"/>
       <w:r>
         <w:t>Clutton-Brock, T. H. 1991. The Evolution of Parental Care. Princeton University Press.</w:t>
       </w:r>
@@ -2486,8 +2458,8 @@
       <w:pPr>
         <w:pStyle w:val="Bibliography"/>
       </w:pPr>
-      <w:bookmarkStart w:id="224" w:name="ref-einum2000"/>
-      <w:bookmarkEnd w:id="223"/>
+      <w:bookmarkStart w:id="226" w:name="ref-einum2000"/>
+      <w:bookmarkEnd w:id="225"/>
       <w:r>
         <w:t>Einum, S., and I. A. Fleming. 2000. Highly fecund mothers sacrifice offspring survival to maximize fitness. Nature 405:565–567.</w:t>
       </w:r>
@@ -2496,8 +2468,8 @@
       <w:pPr>
         <w:pStyle w:val="Bibliography"/>
       </w:pPr>
-      <w:bookmarkStart w:id="225" w:name="ref-falconer1996"/>
-      <w:bookmarkEnd w:id="224"/>
+      <w:bookmarkStart w:id="227" w:name="ref-falconer1996"/>
+      <w:bookmarkEnd w:id="226"/>
       <w:r>
         <w:t>Falconer, D. S., and T. F. C. MacKay. 1996. An Introduction Quantitative Genetics. Pearson Education Limited, Essex, England.</w:t>
       </w:r>
@@ -2506,8 +2478,8 @@
       <w:pPr>
         <w:pStyle w:val="Bibliography"/>
       </w:pPr>
-      <w:bookmarkStart w:id="226" w:name="ref-ficetola2009"/>
-      <w:bookmarkEnd w:id="225"/>
+      <w:bookmarkStart w:id="228" w:name="ref-ficetola2009"/>
+      <w:bookmarkEnd w:id="227"/>
       <w:r>
         <w:t>Ficetola, G. F., and F. De Bernardi. 2009. Offspring size and survival in the frog rana latastei: From among-population to within-clutch variation. Biol J Linn Soc 97:845–853.</w:t>
       </w:r>
@@ -2516,8 +2488,8 @@
       <w:pPr>
         <w:pStyle w:val="Bibliography"/>
       </w:pPr>
-      <w:bookmarkStart w:id="227" w:name="ref-fox2000"/>
-      <w:bookmarkEnd w:id="226"/>
+      <w:bookmarkStart w:id="229" w:name="ref-fox2000"/>
+      <w:bookmarkEnd w:id="228"/>
       <w:r>
         <w:t>Fox, C. W., and M. E. Czesak. 2000. Evolutionary ecology of progeny size in arthropods. Annu Rev Entomol 45:341–369.</w:t>
       </w:r>
@@ -2526,8 +2498,8 @@
       <w:pPr>
         <w:pStyle w:val="Bibliography"/>
       </w:pPr>
-      <w:bookmarkStart w:id="228" w:name="ref-hargitai2005"/>
-      <w:bookmarkEnd w:id="227"/>
+      <w:bookmarkStart w:id="230" w:name="ref-hargitai2005"/>
+      <w:bookmarkEnd w:id="229"/>
       <w:r>
         <w:t>Hargitai, R., J. Török, L. Tóth, G. Hegyi, B. Rosivall, B. Szigeti, and E. Szöllősi. 2005. Effects of environmental conditions and parental quality on inter-and intraclutch egg-size variation in the collared flycatcher (ficedula albicollis). The Auk 122:509–522.</w:t>
       </w:r>
@@ -2536,8 +2508,8 @@
       <w:pPr>
         <w:pStyle w:val="Bibliography"/>
       </w:pPr>
-      <w:bookmarkStart w:id="229" w:name="ref-harvey1983"/>
-      <w:bookmarkEnd w:id="228"/>
+      <w:bookmarkStart w:id="231" w:name="ref-harvey1983"/>
+      <w:bookmarkEnd w:id="230"/>
       <w:r>
         <w:t>Harvey, G. T. 1983. Environmental and genetic effects on mean egg weight in spruce budworm (lepidoptera: tortricidae). The Canadian Entomologist 115:1109–1117.</w:t>
       </w:r>
@@ -2546,8 +2518,8 @@
       <w:pPr>
         <w:pStyle w:val="Bibliography"/>
       </w:pPr>
-      <w:bookmarkStart w:id="230" w:name="ref-honek1993"/>
-      <w:bookmarkEnd w:id="229"/>
+      <w:bookmarkStart w:id="232" w:name="ref-honek1993"/>
+      <w:bookmarkEnd w:id="231"/>
       <w:r>
         <w:t>Honek, A. 1993. Intraspecific variation in body size and fecundity in insects: A general relationship. Oikos 483–492.</w:t>
       </w:r>
@@ -2556,8 +2528,8 @@
       <w:pPr>
         <w:pStyle w:val="Bibliography"/>
       </w:pPr>
-      <w:bookmarkStart w:id="231" w:name="ref-kelly2014"/>
-      <w:bookmarkEnd w:id="230"/>
+      <w:bookmarkStart w:id="233" w:name="ref-kelly2014"/>
+      <w:bookmarkEnd w:id="232"/>
       <w:r>
         <w:t>Kelly, C. D., B. Tawes, and A. Worthington. 2014. Evaluating indices of body condition in two cricket species. Ecology and Evolution 4:4476–4487.</w:t>
       </w:r>
@@ -2566,8 +2538,8 @@
       <w:pPr>
         <w:pStyle w:val="Bibliography"/>
       </w:pPr>
-      <w:bookmarkStart w:id="232" w:name="ref-koch2014"/>
-      <w:bookmarkEnd w:id="231"/>
+      <w:bookmarkStart w:id="234" w:name="ref-koch2014"/>
+      <w:bookmarkEnd w:id="233"/>
       <w:r>
         <w:t>Koch, L. K., and J. Meunier. 2014. Mother and offspring fitness in an insect with maternal care: Phenotypic trade-offs between egg number, egg mass and egg care. BMC Evol Biol 14:125.</w:t>
       </w:r>
@@ -2576,8 +2548,8 @@
       <w:pPr>
         <w:pStyle w:val="Bibliography"/>
       </w:pPr>
-      <w:bookmarkStart w:id="233" w:name="ref-kolliker2007"/>
-      <w:bookmarkEnd w:id="232"/>
+      <w:bookmarkStart w:id="235" w:name="ref-kolliker2007"/>
+      <w:bookmarkEnd w:id="234"/>
       <w:r>
         <w:lastRenderedPageBreak/>
         <w:t>Kölliker, M. 2007. Benefits and costs of earwig (forficula auricularia) family life. Behav Ecol Sociobiol 61:1489–1497.</w:t>
@@ -2587,8 +2559,8 @@
       <w:pPr>
         <w:pStyle w:val="Bibliography"/>
       </w:pPr>
-      <w:bookmarkStart w:id="234" w:name="ref-meunier2024"/>
-      <w:bookmarkEnd w:id="233"/>
+      <w:bookmarkStart w:id="236" w:name="ref-meunier2024"/>
+      <w:bookmarkEnd w:id="235"/>
       <w:r>
         <w:t>Meunier, J. 2024. The biology and social life of earwigs (dermaptera). Annu Rev Entomol 69:259–276.</w:t>
       </w:r>
@@ -2597,8 +2569,8 @@
       <w:pPr>
         <w:pStyle w:val="Bibliography"/>
       </w:pPr>
-      <w:bookmarkStart w:id="235" w:name="ref-nelson2004"/>
-      <w:bookmarkEnd w:id="234"/>
+      <w:bookmarkStart w:id="237" w:name="ref-nelson2004"/>
+      <w:bookmarkEnd w:id="236"/>
       <w:r>
         <w:t>Nelson, N. J., M. B. Thompson, S. Pledger, S. N. Keall, and C. H. Daugherty. 2004. Egg mass determines hatchling size, and incubation temperature influences post‐hatching growth, of tuatara sphenodon punctatus. J Zool 263:77–87.</w:t>
       </w:r>
@@ -2607,8 +2579,8 @@
       <w:pPr>
         <w:pStyle w:val="Bibliography"/>
       </w:pPr>
-      <w:bookmarkStart w:id="236" w:name="ref-nilsson1993"/>
-      <w:bookmarkEnd w:id="235"/>
+      <w:bookmarkStart w:id="238" w:name="ref-nilsson1993"/>
+      <w:bookmarkEnd w:id="237"/>
       <w:r>
         <w:t>Nilsson, J. ‐Å., and E. Svensson. 1993. Causes and consequences of egg mass variation between and within blue tit clutches. J Zool 230:469–481.</w:t>
       </w:r>
@@ -2617,8 +2589,8 @@
       <w:pPr>
         <w:pStyle w:val="Bibliography"/>
       </w:pPr>
-      <w:bookmarkStart w:id="237" w:name="ref-parker1982"/>
-      <w:bookmarkEnd w:id="236"/>
+      <w:bookmarkStart w:id="239" w:name="ref-parker1982"/>
+      <w:bookmarkEnd w:id="238"/>
       <w:r>
         <w:t>Parker, G. A. 1982. Why are there so many tiny sperm? Sperm competition and the maintenance of two sexes. J Theor Biol 96:281–294.</w:t>
       </w:r>
@@ -2627,8 +2599,8 @@
       <w:pPr>
         <w:pStyle w:val="Bibliography"/>
       </w:pPr>
-      <w:bookmarkStart w:id="238" w:name="ref-peig2009"/>
-      <w:bookmarkEnd w:id="237"/>
+      <w:bookmarkStart w:id="240" w:name="ref-peig2009"/>
+      <w:bookmarkEnd w:id="239"/>
       <w:r>
         <w:t>Peig, J., and A. J. Green. 2009. New perspectives for estimating body condition from mass/length data: The scaled mass index as an alternative method. Oikos 118:1883–1891.</w:t>
       </w:r>
@@ -2637,8 +2609,8 @@
       <w:pPr>
         <w:pStyle w:val="Bibliography"/>
       </w:pPr>
-      <w:bookmarkStart w:id="239" w:name="ref-peig2010"/>
-      <w:bookmarkEnd w:id="238"/>
+      <w:bookmarkStart w:id="241" w:name="ref-peig2010"/>
+      <w:bookmarkEnd w:id="240"/>
       <w:r>
         <w:t>Peig, J., and A. J. Green. 2010. The paradigm of body condition: A critical reappraisal of current methods based on mass and length. Funct Ecol 24:1323–1332.</w:t>
       </w:r>
@@ -2647,8 +2619,8 @@
       <w:pPr>
         <w:pStyle w:val="Bibliography"/>
       </w:pPr>
-      <w:bookmarkStart w:id="240" w:name="ref-r2013"/>
-      <w:bookmarkEnd w:id="239"/>
+      <w:bookmarkStart w:id="242" w:name="ref-r2013"/>
+      <w:bookmarkEnd w:id="241"/>
       <w:r>
         <w:t>R Core Team. 2025. R: A language and environment for statistical computing. Vienna, Austria.</w:t>
       </w:r>
@@ -2657,8 +2629,8 @@
       <w:pPr>
         <w:pStyle w:val="Bibliography"/>
       </w:pPr>
-      <w:bookmarkStart w:id="241" w:name="ref-reznick2000"/>
-      <w:bookmarkEnd w:id="240"/>
+      <w:bookmarkStart w:id="243" w:name="ref-reznick2000"/>
+      <w:bookmarkEnd w:id="242"/>
       <w:r>
         <w:t>Reznick, D., L. Nunney, and A. Tessier. 2000. Big houses, big cars, superfleas and the costs of reproduction. Trends Ecol Evol 15:421–425.</w:t>
       </w:r>
@@ -2667,8 +2639,8 @@
       <w:pPr>
         <w:pStyle w:val="Bibliography"/>
       </w:pPr>
-      <w:bookmarkStart w:id="242" w:name="ref-roff1992a"/>
-      <w:bookmarkEnd w:id="241"/>
+      <w:bookmarkStart w:id="244" w:name="ref-roff1992a"/>
+      <w:bookmarkEnd w:id="243"/>
       <w:r>
         <w:t>Roff, D. 1992. Evolution of Life Histories: Theory and Analysis. Chapman &amp; Hall, Inc., New York, NY.</w:t>
       </w:r>
@@ -2677,8 +2649,8 @@
       <w:pPr>
         <w:pStyle w:val="Bibliography"/>
       </w:pPr>
-      <w:bookmarkStart w:id="243" w:name="ref-schindelin2012"/>
-      <w:bookmarkEnd w:id="242"/>
+      <w:bookmarkStart w:id="245" w:name="ref-schindelin2012"/>
+      <w:bookmarkEnd w:id="244"/>
       <w:r>
         <w:t>Schindelin, J., I. Arganda-Carreras, E. Frise, V. Kaynig, M. Longair, T. Pietzsch, S. Preibisch, C. Rueden, S. Saalfeld, B. Schmid, J.-Y. Tinevez, D. J. White, V. Hartenstein, K. Eliceiri, P. Tomancak, and A. Cardona. 2012. Fiji: An open-source platform for biological-image analysis. Nat Methods 9:676–682. Max Planck Institute of Molecular Cell Biology; Genetics, Dresden, Germany.</w:t>
       </w:r>
@@ -2687,8 +2659,8 @@
       <w:pPr>
         <w:pStyle w:val="Bibliography"/>
       </w:pPr>
-      <w:bookmarkStart w:id="244" w:name="ref-seko2006"/>
-      <w:bookmarkEnd w:id="243"/>
+      <w:bookmarkStart w:id="246" w:name="ref-seko2006"/>
+      <w:bookmarkEnd w:id="245"/>
       <w:r>
         <w:t>Seko, T., T. Miyatake, S. Fujioka, and F. Nakasuji. 2006. Genetic and environmental sources of egg size, fecundity and body size in the migrant skipper, parnara guttata guttata (lepidoptera: hesperiidae). Popul Ecol 48:225–232.</w:t>
       </w:r>
@@ -2697,8 +2669,8 @@
       <w:pPr>
         <w:pStyle w:val="Bibliography"/>
       </w:pPr>
-      <w:bookmarkStart w:id="245" w:name="ref-shine1978"/>
-      <w:bookmarkEnd w:id="244"/>
+      <w:bookmarkStart w:id="247" w:name="ref-shine1978"/>
+      <w:bookmarkEnd w:id="246"/>
       <w:r>
         <w:t>Shine, R. 1978. Propagule size and parental care: The “safe harbor” hypothesis. J Theor Biol 75:417–424.</w:t>
       </w:r>
@@ -2707,8 +2679,8 @@
       <w:pPr>
         <w:pStyle w:val="Bibliography"/>
       </w:pPr>
-      <w:bookmarkStart w:id="246" w:name="ref-simpson1951"/>
-      <w:bookmarkEnd w:id="245"/>
+      <w:bookmarkStart w:id="248" w:name="ref-simpson1951"/>
+      <w:bookmarkEnd w:id="247"/>
       <w:r>
         <w:t>Simpson, E. H. 1951. The interpretation of interaction in contingency tables. Journal of the Royal Statistical Society: Series B (Methodological) 13:238–241.</w:t>
       </w:r>
@@ -2717,8 +2689,8 @@
       <w:pPr>
         <w:pStyle w:val="Bibliography"/>
       </w:pPr>
-      <w:bookmarkStart w:id="247" w:name="ref-slagsvold1984"/>
-      <w:bookmarkEnd w:id="246"/>
+      <w:bookmarkStart w:id="249" w:name="ref-slagsvold1984"/>
+      <w:bookmarkEnd w:id="248"/>
       <w:r>
         <w:t>Slagsvold, T., J. Sandvik, G. Rofstad, Ö. Lorentsen, and M. Husby. 1984. On the adaptive value of intraclutch egg-size variation in birds. The Auk 101:685–697.</w:t>
       </w:r>
@@ -2727,8 +2699,8 @@
       <w:pPr>
         <w:pStyle w:val="Bibliography"/>
       </w:pPr>
-      <w:bookmarkStart w:id="248" w:name="ref-smith1974"/>
-      <w:bookmarkEnd w:id="247"/>
+      <w:bookmarkStart w:id="250" w:name="ref-smith1974"/>
+      <w:bookmarkEnd w:id="249"/>
       <w:r>
         <w:t>Smith, C. C., and S. D. Fretwell. 1974. The optimal balance between size and number of offspring. Am Nat 108:499–506.</w:t>
       </w:r>
@@ -2737,8 +2709,8 @@
       <w:pPr>
         <w:pStyle w:val="Bibliography"/>
       </w:pPr>
-      <w:bookmarkStart w:id="249" w:name="ref-staerkle2008"/>
-      <w:bookmarkEnd w:id="248"/>
+      <w:bookmarkStart w:id="251" w:name="ref-staerkle2008"/>
+      <w:bookmarkEnd w:id="250"/>
       <w:r>
         <w:lastRenderedPageBreak/>
         <w:t>Staerkle, M., and M. Kölliker. 2008. Maternal food regurgitation to nymphs in earwigs (</w:t>
@@ -2758,8 +2730,8 @@
       <w:pPr>
         <w:pStyle w:val="Bibliography"/>
       </w:pPr>
-      <w:bookmarkStart w:id="250" w:name="ref-stearns1992"/>
-      <w:bookmarkEnd w:id="249"/>
+      <w:bookmarkStart w:id="252" w:name="ref-stearns1992"/>
+      <w:bookmarkEnd w:id="251"/>
       <w:r>
         <w:t>Stearns, S. C. 1992. The Evolution of Life Histories. Oxford University Press.</w:t>
       </w:r>
@@ -2768,8 +2740,8 @@
       <w:pPr>
         <w:pStyle w:val="Bibliography"/>
       </w:pPr>
-      <w:bookmarkStart w:id="251" w:name="ref-stoffel2017"/>
-      <w:bookmarkEnd w:id="250"/>
+      <w:bookmarkStart w:id="253" w:name="ref-stoffel2017"/>
+      <w:bookmarkEnd w:id="252"/>
       <w:r>
         <w:t>Stoffel, M. A., S. Nakagawa, and H. Schielzeth. 2017. RptR: Repeatability estimation and variance decomposition by generalized linear mixed‐effects models. Methods Ecol Evol 8:1639–1644.</w:t>
       </w:r>
@@ -2778,8 +2750,8 @@
       <w:pPr>
         <w:pStyle w:val="Bibliography"/>
       </w:pPr>
-      <w:bookmarkStart w:id="252" w:name="ref-torres-vila2012"/>
-      <w:bookmarkEnd w:id="251"/>
+      <w:bookmarkStart w:id="254" w:name="ref-torres-vila2012"/>
+      <w:bookmarkEnd w:id="253"/>
       <w:r>
         <w:t xml:space="preserve">Torres-Vila, L., E. Cruces-Caldera, M. Rodrı́guez-Molina, and L. Cauterruccio. 2012. Host plant selects for egg size in the moth lobesia botrana: Integrating reproductive and ecological trade-offs is not a simple matter. Pp. 145–167 </w:t>
       </w:r>
@@ -2798,8 +2770,8 @@
       <w:pPr>
         <w:pStyle w:val="Bibliography"/>
       </w:pPr>
-      <w:bookmarkStart w:id="253" w:name="ref-tourneur2018"/>
-      <w:bookmarkEnd w:id="252"/>
+      <w:bookmarkStart w:id="255" w:name="ref-tourneur2018"/>
+      <w:bookmarkEnd w:id="254"/>
       <w:r>
         <w:t xml:space="preserve">Tourneur, J.-C. 2018. Factors affecting the egg-laying pattern of </w:t>
       </w:r>
@@ -2818,8 +2790,8 @@
       <w:pPr>
         <w:pStyle w:val="Bibliography"/>
       </w:pPr>
-      <w:bookmarkStart w:id="254" w:name="ref-tourneur1992"/>
-      <w:bookmarkEnd w:id="253"/>
+      <w:bookmarkStart w:id="256" w:name="ref-tourneur1992"/>
+      <w:bookmarkEnd w:id="255"/>
       <w:r>
         <w:t xml:space="preserve">Tourneur, J.-C., and J. Gingras. 1992. Egg laying in a northeastern North American (montréal, québec) population of </w:t>
       </w:r>
@@ -2838,8 +2810,8 @@
       <w:pPr>
         <w:pStyle w:val="Bibliography"/>
       </w:pPr>
-      <w:bookmarkStart w:id="255" w:name="ref-vannoordwijk1986"/>
-      <w:bookmarkEnd w:id="254"/>
+      <w:bookmarkStart w:id="257" w:name="ref-vannoordwijk1986"/>
+      <w:bookmarkEnd w:id="256"/>
       <w:r>
         <w:t>Van Noordwijk, A. J., and G. de Jong. 1986. Acquisition and allocation of resources: Their influence on variation in life history tactics. Am Nat 128:137–142.</w:t>
       </w:r>
@@ -2848,8 +2820,8 @@
       <w:pPr>
         <w:pStyle w:val="Bibliography"/>
       </w:pPr>
-      <w:bookmarkStart w:id="256" w:name="ref-vehtari2017"/>
-      <w:bookmarkEnd w:id="255"/>
+      <w:bookmarkStart w:id="258" w:name="ref-vehtari2017"/>
+      <w:bookmarkEnd w:id="257"/>
       <w:r>
         <w:t>Vehtari, A., A. Gelman, and J. Gabry. 2017. Practical Bayesian model evaluation using leave-one-out cross-validation and WAIC. Statistics and Computing 27:1413–1432.</w:t>
       </w:r>
@@ -2858,8 +2830,8 @@
       <w:pPr>
         <w:pStyle w:val="Bibliography"/>
       </w:pPr>
-      <w:bookmarkStart w:id="257" w:name="ref-williams1994"/>
-      <w:bookmarkEnd w:id="256"/>
+      <w:bookmarkStart w:id="259" w:name="ref-williams1994"/>
+      <w:bookmarkEnd w:id="258"/>
       <w:r>
         <w:t>Williams, T. D. 1994. Intraspecific variation in egg size and egg composition in birds: Effects on offspring fitness. Biol Rev Camb Philos Soc 69:35–59.</w:t>
       </w:r>
@@ -2868,8 +2840,8 @@
       <w:pPr>
         <w:pStyle w:val="Bibliography"/>
       </w:pPr>
-      <w:bookmarkStart w:id="258" w:name="ref-winkler1987"/>
-      <w:bookmarkEnd w:id="257"/>
+      <w:bookmarkStart w:id="260" w:name="ref-winkler1987"/>
+      <w:bookmarkEnd w:id="259"/>
       <w:r>
         <w:t>Winkler, D. W., and K. Wallin. 1987. Offspring size and number: A life history model linking effort per offspring and total effort. Am Nat 129:708–720.</w:t>
       </w:r>
@@ -2878,8 +2850,8 @@
       <w:pPr>
         <w:pStyle w:val="Bibliography"/>
       </w:pPr>
-      <w:bookmarkStart w:id="259" w:name="ref-yanagi2006"/>
-      <w:bookmarkEnd w:id="258"/>
+      <w:bookmarkStart w:id="261" w:name="ref-yanagi2006"/>
+      <w:bookmarkEnd w:id="260"/>
       <w:r>
         <w:t>Yanagi, S., T. Oikawa, and T. Miyatake. 2006. Heritability and genetic correlation estimates for egg size and number in callosobruchus chinensis (coleoptera: bruchidae). Ann Entomol Soc Am 99:364–368.</w:t>
       </w:r>
@@ -2888,14 +2860,14 @@
       <w:pPr>
         <w:pStyle w:val="Bibliography"/>
       </w:pPr>
-      <w:bookmarkStart w:id="260" w:name="ref-yosef2008"/>
-      <w:bookmarkEnd w:id="259"/>
+      <w:bookmarkStart w:id="262" w:name="ref-yosef2008"/>
+      <w:bookmarkEnd w:id="261"/>
       <w:r>
         <w:t>Yosef, R., and P. Zduniak. 2008. Variation in clutch size, egg size variability and reproductive output in the desert finch (rhodospiza obsoleta). J Arid Environ 72:1631–1635.</w:t>
       </w:r>
     </w:p>
-    <w:bookmarkEnd w:id="216"/>
-    <w:bookmarkEnd w:id="260"/>
+    <w:bookmarkEnd w:id="218"/>
+    <w:bookmarkEnd w:id="262"/>
     <w:p>
       <w:pPr>
         <w:sectPr>
@@ -2935,7 +2907,7 @@
               <w:pStyle w:val="Compact"/>
               <w:jc w:val="center"/>
             </w:pPr>
-            <w:bookmarkStart w:id="261" w:name="fig-one"/>
+            <w:bookmarkStart w:id="263" w:name="fig-one"/>
             <w:r>
               <w:rPr>
                 <w:noProof/>
@@ -2988,7 +2960,7 @@
               <w:pStyle w:val="ImageCaption"/>
               <w:spacing w:before="200"/>
             </w:pPr>
-            <w:bookmarkStart w:id="262" w:name="_Hlk219273106"/>
+            <w:bookmarkStart w:id="264" w:name="_Hlk219273106"/>
             <w:r>
               <w:t>Figure 1: Mean egg perimeter (mm) plotted against clutch size for the first (salmon) and second (blue) clutches of n = 42 female European earwigs (</w:t>
             </w:r>
@@ -3002,10 +2974,10 @@
             <w:r>
               <w:t>). Data are raw values.</w:t>
             </w:r>
-            <w:bookmarkEnd w:id="262"/>
+            <w:bookmarkEnd w:id="264"/>
           </w:p>
         </w:tc>
-        <w:bookmarkEnd w:id="261"/>
+        <w:bookmarkEnd w:id="263"/>
       </w:tr>
     </w:tbl>
     <w:p>
@@ -3036,7 +3008,7 @@
               <w:pStyle w:val="Compact"/>
               <w:jc w:val="center"/>
             </w:pPr>
-            <w:bookmarkStart w:id="263" w:name="fig-two"/>
+            <w:bookmarkStart w:id="265" w:name="fig-two"/>
             <w:r>
               <w:rPr>
                 <w:noProof/>
@@ -3089,7 +3061,7 @@
               <w:pStyle w:val="ImageCaption"/>
               <w:spacing w:before="200"/>
             </w:pPr>
-            <w:bookmarkStart w:id="264" w:name="_Hlk219273123"/>
+            <w:bookmarkStart w:id="266" w:name="_Hlk219273123"/>
             <w:r>
               <w:lastRenderedPageBreak/>
               <w:t>Figure 2: (a) Among and (b) within-female egg size variation in the first and second clutches of n = 42 female European earwigs (</w:t>
@@ -3104,12 +3076,12 @@
             <w:r>
               <w:t>).</w:t>
             </w:r>
-            <w:bookmarkEnd w:id="264"/>
+            <w:bookmarkEnd w:id="266"/>
           </w:p>
         </w:tc>
-        <w:bookmarkEnd w:id="263"/>
+        <w:bookmarkEnd w:id="265"/>
       </w:tr>
-      <w:bookmarkEnd w:id="214"/>
+      <w:bookmarkEnd w:id="216"/>
     </w:tbl>
     <w:p/>
     <w:sectPr>
@@ -4523,6 +4495,7 @@
   <w:style w:type="character" w:default="1" w:styleId="DefaultParagraphFont">
     <w:name w:val="Default Paragraph Font"/>
     <w:uiPriority w:val="1"/>
+    <w:semiHidden/>
     <w:unhideWhenUsed/>
   </w:style>
   <w:style w:type="table" w:default="1" w:styleId="TableNormal">

</xml_diff>